<commit_message>
feat: align W2-W18 materials to v7
</commit_message>
<xml_diff>
--- a/worksheets/W11.docx
+++ b/worksheets/W11.docx
@@ -51,7 +51,7 @@
           <w:color w:val="5B6573"/>
           <w:sz w:val="22"/>
         </w:rPr>
-        <w:t>主張甲者讀乙，主張乙者讀甲；未定者任選一篇。公平重建不等於同意。</w:t>
+        <w:t>主張甲者讀乙，主張乙者讀甲；未定者任選一篇。先完成本人 V1；AI 只能在 V1 後依公告條件使用。</w:t>
       </w:r>
     </w:p>
     <w:p>
@@ -908,7 +908,7 @@
           <w:color w:val="5B6573"/>
           <w:sz w:val="22"/>
         </w:rPr>
-        <w:t>同儕拿反方原文檢查，不憑印象宣布對錯。這是 0 分練習，留下 Gate 3 歷程。</w:t>
+        <w:t>同儕拿反方原文檢查，不憑印象宣布對錯。這是 W11–W12 正式 10 分證據，也是 Gate 3 的 0 分歷程。</w:t>
       </w:r>
     </w:p>
     <w:p>
@@ -945,7 +945,7 @@
           <w:color w:val="1A2340"/>
           <w:sz w:val="30"/>
         </w:rPr>
-        <w:t>原文核對｜形成性證據</w:t>
+        <w:t>原文核對｜正式任務證據</w:t>
       </w:r>
     </w:p>
     <w:p>
@@ -1717,7 +1717,7 @@
           <w:color w:val="5B6573"/>
           <w:sz w:val="22"/>
         </w:rPr>
-        <w:t>第一次檢查我代表反方；這一次檢查同學代表我，方向不同。</w:t>
+        <w:t>第一次檢查我代表反方；第二次檢查同學代表我。缺席／核准替代使用同一組原文、同一工具時序與等值教師回饋。</w:t>
       </w:r>
     </w:p>
     <w:p>
@@ -2252,7 +2252,7 @@
           <w:color w:val="1A2340"/>
           <w:sz w:val="30"/>
         </w:rPr>
-        <w:t>具體最後決定｜形成性證據</w:t>
+        <w:t>具體最後決定｜正式任務證據</w:t>
       </w:r>
     </w:p>
     <w:p>

</xml_diff>